<commit_message>
Triển khai tại trading.tieunguyetpham.store bằng Docker cạnh ppmeeting
- Thêm Dockerfile, .dockerignore, deploy/docker-compose.yml (mạng ppmeeting_default, 512 MB RAM)
- nginx-trading.conf: server block cho tên miền con, dùng chung chứng chỉ ppmeeting
- deploy.sh: git pull, build, chờ healthy
- Bỏ cấu hình systemd và sub-path /trading
- Cập nhật README, prompt.docx; thêm tools/make_prompt_docx.py

Co-Authored-By: Claude Opus 5.5 <noreply@anthropic.com>
</commit_message>
<xml_diff>
--- a/prompt.docx
+++ b/prompt.docx
@@ -20,7 +20,7 @@
           <w:color w:val="555555"/>
           <w:sz w:val="18"/>
         </w:rPr>
-        <w:t>Phiên bản cập nhật 07/10/2026 · Repo: https://github.com/tieunguyetpham/Claude-CK · Triển khai: https://tieunguyetpham.store/trading</w:t>
+        <w:t>Phiên bản cập nhật 07/10/2026 · Repo: https://github.com/tieunguyetpham/Claude-CK · Triển khai: https://trading.tieunguyetpham.store</w:t>
       </w:r>
     </w:p>
     <w:p>
@@ -469,9 +469,11 @@
         <w:br/>
         <w:t>requirements.txt  khóa phiên bản đã kiểm thử (Python &gt;= 3.11)</w:t>
         <w:br/>
-        <w:t>deploy/           systemd service, cấu hình Nginx, deploy.sh</w:t>
+        <w:t>Dockerfile        đóng gói app (python:3.12-slim, user không phải root, healthcheck)</w:t>
         <w:br/>
-        <w:t>.gitignore, .gitattributes (ép LF cho .sh/.conf/.service), README.md</w:t>
+        <w:t>deploy/           docker-compose.yml, nginx-trading.conf, deploy.sh</w:t>
+        <w:br/>
+        <w:t>.gitignore, .dockerignore, .gitattributes (ép LF cho .sh/.conf), README.md</w:t>
       </w:r>
     </w:p>
     <w:p>
@@ -547,11 +549,8 @@
       </w:r>
     </w:p>
     <w:p>
-      <w:pPr>
-        <w:pStyle w:val="ListBullet"/>
-      </w:pPr>
       <w:r>
-        <w:t>VPS Ubuntu 24.04 (cần Python ≥ 3.11). App phục vụ tại https://tieunguyetpham.store/trading.</w:t>
+        <w:t>App phục vụ tại tên miền con https://trading.tieunguyetpham.store trên VPS 116.118.6.222 (Ubuntu 24.04). VPS đang chạy hệ thống ppmeeting bằng Docker — tuyệt đối không làm gián đoạn hệ thống này.</w:t>
       </w:r>
     </w:p>
     <w:p>
@@ -559,7 +558,7 @@
         <w:pStyle w:val="ListBullet"/>
       </w:pPr>
       <w:r>
-        <w:t>Trỏ bản ghi A của tieunguyetpham.store (và www) về IP VPS.</w:t>
+        <w:t>Khảo sát VPS trước (chỉ đọc): hệ điều hành, RAM, cổng đang dùng, web server đang giữ cổng 80/443, cấu hình Nginx, chứng chỉ và cơ chế gia hạn hiện có. Không cài thêm web server tranh cổng 80/443.</w:t>
       </w:r>
     </w:p>
     <w:p>
@@ -567,7 +566,7 @@
         <w:pStyle w:val="ListBullet"/>
       </w:pPr>
       <w:r>
-        <w:t>deploy/deploy.sh (chạy lại nhiều lần an toàn): cài python3-venv, git, nginx, certbot; tạo user hệ thống; git clone/pull vào /opt/Claude-CK; cài requirements; chạy Streamlit bằng systemd ở 127.0.0.1:8501 với --server.baseUrlPath trading; cấu hình Nginx location /trading/ có hỗ trợ WebSocket; kiểm tra /trading/_stcore/health.</w:t>
+        <w:t>Hiện trạng: container ppmeeting-nginx-1 (nginx:1.27-alpine) giữ cổng 80/443, cấu hình tại /opt/ppmeeting/infra/nginx/nginx.conf, chứng chỉ tại /opt/ppmeeting/infra/nginx/certs; certbot cấp kiểu standalone, có hook pre/post (dừng/chạy lại Nginx) và deploy (chép chứng chỉ) tại /etc/letsencrypt/renewal-hooks.</w:t>
       </w:r>
     </w:p>
     <w:p>
@@ -575,7 +574,7 @@
         <w:pStyle w:val="ListBullet"/>
       </w:pPr>
       <w:r>
-        <w:t>Không ghi đè cấu hình Nginx sẵn có của tên miền — chỉ nhắc thêm include snippets/trading.conf.</w:t>
+        <w:t>Đóng gói app bằng Dockerfile; chạy container riêng trading-app qua deploy/docker-compose.yml, giới hạn 512 MB RAM, restart unless-stopped, healthcheck /_stcore/health, nối vào mạng có sẵn ppmeeting_default (external).</w:t>
       </w:r>
     </w:p>
     <w:p>
@@ -583,7 +582,7 @@
         <w:pStyle w:val="ListBullet"/>
       </w:pPr>
       <w:r>
-        <w:t>Bật HTTPS: certbot --nginx -d tieunguyetpham.store -d www.tieunguyetpham.store.</w:t>
+        <w:t>DNS: bản ghi A trading.tieunguyetpham.store → 116.118.6.222.</w:t>
       </w:r>
     </w:p>
     <w:p>
@@ -591,7 +590,39 @@
         <w:pStyle w:val="ListBullet"/>
       </w:pPr>
       <w:r>
-        <w:t>Cập nhật phiên bản: chạy lại deploy.sh. Xem log: journalctl -u trading.</w:t>
+        <w:t>Repo Private: tạo deploy key chỉ-đọc trên VPS, thêm vào GitHub (Settings → Deploy keys), clone vào /opt/Claude-CK.</w:t>
+      </w:r>
+    </w:p>
+    <w:p>
+      <w:pPr>
+        <w:pStyle w:val="ListBullet"/>
+      </w:pPr>
+      <w:r>
+        <w:t>HTTPS: bổ sung trading.tieunguyetpham.store vào chứng chỉ sẵn có (certbot certonly --standalone --expand --cert-name tieunguyetpham.store, dùng lại các hook của ppmeeting) để cơ chế tự gia hạn tiếp tục hoạt động.</w:t>
+      </w:r>
+    </w:p>
+    <w:p>
+      <w:pPr>
+        <w:pStyle w:val="ListBullet"/>
+      </w:pPr>
+      <w:r>
+        <w:t>Nginx: sao lưu nginx.conf, thêm một server block server_name trading.tieunguyetpham.store dùng chung chứng chỉ; proxy tới http://trading-app:8501 qua biến và resolver 127.0.0.11 (Nginx vẫn khởi động khi trading-app dừng); hỗ trợ WebSocket; kiểm tra nginx -t trước khi nginx -s reload.</w:t>
+      </w:r>
+    </w:p>
+    <w:p>
+      <w:pPr>
+        <w:pStyle w:val="ListBullet"/>
+      </w:pPr>
+      <w:r>
+        <w:t>deploy/deploy.sh dùng để cập nhật: git pull → docker compose up -d --build → chờ healthy → dọn image cũ.</w:t>
+      </w:r>
+    </w:p>
+    <w:p>
+      <w:pPr>
+        <w:pStyle w:val="ListBullet"/>
+      </w:pPr>
+      <w:r>
+        <w:t>Kiểm tra sau triển khai: trang trading chạy qua HTTPS, trang ppmeeting và /api/ vẫn hoạt động bình thường.</w:t>
       </w:r>
     </w:p>
     <w:sectPr>

</xml_diff>

<commit_message>
Sửa lỗi phát hiện khi rà soát trước triển khai
- Không lưu cache kết quả lỗi mạng (trước đây kẹt lỗi 5 phút)
- Ghép báo giá realtime vào nến cuối để phân tích theo giá mới nhất trong phiên
- Mỗi luồng dùng requests.Session riêng
- deploy.sh chỉ dọn image của trading (nhãn app=trading-app)
- README: chạy hook certbot thủ công, sửa nginx.conf giữ nguyên inode
- Thêm tests/test_data.py; cập nhật prompt.docx

Co-Authored-By: Claude Opus 5.5 <noreply@anthropic.com>
</commit_message>
<xml_diff>
--- a/prompt.docx
+++ b/prompt.docx
@@ -198,7 +198,23 @@
         <w:pStyle w:val="ListBullet"/>
       </w:pPr>
       <w:r>
-        <w:t>Cache bằng st.cache_data (TTL 5 phút); tải nhiều mã song song bằng ThreadPoolExecutor.</w:t>
+        <w:t>Ghép báo giá realtime vào nến cuối (thêm nến phiên hôm nay hoặc cập nhật nến cùng ngày) để phân tích luôn dùng giá mới nhất trong phiên, khớp với giá đang hiển thị.</w:t>
+      </w:r>
+    </w:p>
+    <w:p>
+      <w:pPr>
+        <w:pStyle w:val="ListBullet"/>
+      </w:pPr>
+      <w:r>
+        <w:t>Cache bằng st.cache_data (TTL 5 phút) nhưng KHÔNG lưu cache kết quả lỗi mạng (lỗi tạm thời phải thử lại ngay).</w:t>
+      </w:r>
+    </w:p>
+    <w:p>
+      <w:pPr>
+        <w:pStyle w:val="ListBullet"/>
+      </w:pPr>
+      <w:r>
+        <w:t>Tải nhiều mã song song bằng ThreadPoolExecutor; mỗi luồng dùng requests.Session riêng (threading.local).</w:t>
       </w:r>
     </w:p>
     <w:p>
@@ -497,7 +513,15 @@
         <w:pStyle w:val="ListBullet"/>
       </w:pPr>
       <w:r>
-        <w:t>pytest cho: chuỗi rỗng, chữ thường, trùng mã, ký tự đặc biệt, chữ có dấu, chuỗi dài; dữ liệu 1 phiên, 2 phiên, giá đứng yên, chỉ tăng, chỉ giảm, khối lượng 0.</w:t>
+        <w:t>pytest cho: chuỗi rỗng, chữ thường, trùng mã, ký tự đặc biệt, chữ có dấu, chuỗi dài; dữ liệu 1 phiên, 2 phiên, giá đứng yên, chỉ tăng, chỉ giảm, khối lượng 0; ghép báo giá realtime (phiên mới, cùng phiên, báo giá cũ, chưa khớp lệnh, ngày sai định dạng).</w:t>
+      </w:r>
+    </w:p>
+    <w:p>
+      <w:pPr>
+        <w:pStyle w:val="ListBullet"/>
+      </w:pPr>
+      <w:r>
+        <w:t>Giả lập mất mạng: app báo lỗi rõ ràng; có mạng lại thì tải được ngay, không bị kẹt lỗi trong cache.</w:t>
       </w:r>
     </w:p>
     <w:p>
@@ -598,7 +622,7 @@
         <w:pStyle w:val="ListBullet"/>
       </w:pPr>
       <w:r>
-        <w:t>HTTPS: bổ sung trading.tieunguyetpham.store vào chứng chỉ sẵn có (certbot certonly --standalone --expand --cert-name tieunguyetpham.store, dùng lại các hook của ppmeeting) để cơ chế tự gia hạn tiếp tục hoạt động.</w:t>
+        <w:t>HTTPS: bổ sung trading.tieunguyetpham.store vào chứng chỉ sẵn có (certbot certonly --standalone --expand --cert-name tieunguyetpham.store) để cơ chế tự gia hạn tiếp tục hoạt động. Chạy hook pre/deploy/post của ppmeeting thủ công, không truyền --pre-hook/--post-hook (tránh certbot lưu hook trùng); hook post luôn chạy kể cả khi lỗi.</w:t>
       </w:r>
     </w:p>
     <w:p>
@@ -606,7 +630,7 @@
         <w:pStyle w:val="ListBullet"/>
       </w:pPr>
       <w:r>
-        <w:t>Nginx: sao lưu nginx.conf, thêm một server block server_name trading.tieunguyetpham.store dùng chung chứng chỉ; proxy tới http://trading-app:8501 qua biến và resolver 127.0.0.11 (Nginx vẫn khởi động khi trading-app dừng); hỗ trợ WebSocket; kiểm tra nginx -t trước khi nginx -s reload.</w:t>
+        <w:t>Nginx: sao lưu nginx.conf, thêm một server block server_name trading.tieunguyetpham.store dùng chung chứng chỉ; proxy tới http://trading-app:8501 qua biến và resolver 127.0.0.11 (Nginx vẫn khởi động khi trading-app dừng); hỗ trợ WebSocket. nginx.conf được bind-mount dạng một file đơn → sửa bằng cách ghi đè nội dung (giữ inode), không dùng sed -i/mv. Thử nginx -t trên container tạm trước, rồi mới nginx -t và nginx -s reload thật.</w:t>
       </w:r>
     </w:p>
     <w:p>
@@ -614,7 +638,7 @@
         <w:pStyle w:val="ListBullet"/>
       </w:pPr>
       <w:r>
-        <w:t>deploy/deploy.sh dùng để cập nhật: git pull → docker compose up -d --build → chờ healthy → dọn image cũ.</w:t>
+        <w:t>deploy/deploy.sh dùng để cập nhật: git pull → docker compose up -d --build → chờ healthy → chỉ dọn image cũ có nhãn app=trading-app (không đụng image của ppmeeting).</w:t>
       </w:r>
     </w:p>
     <w:p>

</xml_diff>

<commit_message>
Rổ VN50 lấy trực tiếp từ SSI (VNX50), bổ sung ngân hàng NVB, VBB
- Danh sách rổ soạn tay đã lỗi thời (lệch 11/50 mã): nay lấy thành phần VNX50 từ SSI, cache 6 giờ, có dự phòng
- Lọc mã rổ chặt chẽ (None không thành mã "NONE")
- Mã mặc định luôn thuộc danh sách lựa chọn
- Giới hạn số mục cache để không phình RAM
- Thêm test fetch_group; cập nhật README, prompt.docx

Co-Authored-By: Claude Opus 5.5 <noreply@anthropic.com>
</commit_message>
<xml_diff>
--- a/prompt.docx
+++ b/prompt.docx
@@ -206,7 +206,7 @@
         <w:pStyle w:val="ListBullet"/>
       </w:pPr>
       <w:r>
-        <w:t>Cache bằng st.cache_data (TTL 5 phút) nhưng KHÔNG lưu cache kết quả lỗi mạng (lỗi tạm thời phải thử lại ngay).</w:t>
+        <w:t>Cache bằng st.cache_data (TTL 5 phút, giới hạn 64 mục để không phình RAM khi nhiều người dùng) nhưng KHÔNG lưu cache kết quả lỗi mạng (lỗi tạm thời phải thử lại ngay).</w:t>
       </w:r>
     </w:p>
     <w:p>
@@ -230,7 +230,7 @@
         <w:pStyle w:val="ListBullet"/>
       </w:pPr>
       <w:r>
-        <w:t>Rổ VN50: 30 mã VN30 + 20 mã vốn hóa lớn, thanh khoản cao trên HOSE.</w:t>
+        <w:t>Rổ VN50 = chỉ số VNX50 (50 mã lớn nhất HOSE + HNX). SSI không có nhóm tên "VN50" (trả rỗng). Lấy thành phần trực tiếp: GET https://iboard-query.ssi.com.vn/stock/group/VNX50 → data[].stockSymbol; cache 6 giờ để tự cập nhật khi rổ cơ cấu lại. Kèm danh sách dự phòng (snapshot) khi API lỗi; không lưu cache khi phải dùng dự phòng.</w:t>
       </w:r>
     </w:p>
     <w:p>
@@ -238,7 +238,31 @@
         <w:pStyle w:val="ListBullet"/>
       </w:pPr>
       <w:r>
-        <w:t>Nhóm ngân hàng: các ngân hàng niêm yết trên HOSE, HNX, UPCoM (VCB, BID, CTG, TCB, MBB, ACB, VPB, HDB, STB, TPB, SHB, VIB, LPB, SSB, EIB, MSB, OCB, NAB, ABB, BVB, KLB, VAB, BAB, SGB, PGB).</w:t>
+        <w:t>Lọc kết quả rổ: chỉ nhận chuỗi 3–10 ký tự A–Z/0–9 (giá trị None không được thành mã "NONE"); dưới 20 mã coi như lỗi.</w:t>
+      </w:r>
+    </w:p>
+    <w:p>
+      <w:pPr>
+        <w:pStyle w:val="ListBullet"/>
+      </w:pPr>
+      <w:r>
+        <w:t>Không tự soạn tay danh sách rổ chỉ số: danh sách tự soạn dễ lỗi thời (đã kiểm chứng lệch 11/50 mã so với VNX50).</w:t>
+      </w:r>
+    </w:p>
+    <w:p>
+      <w:pPr>
+        <w:pStyle w:val="ListBullet"/>
+      </w:pPr>
+      <w:r>
+        <w:t>Nhóm ngân hàng (27 mã, HOSE/HNX/UPCoM): VCB, BID, CTG, TCB, MBB, ACB, VPB, HDB, STB, TPB, SHB, VIB, LPB, SSB, EIB, MSB, OCB, NAB, ABB, BVB, KLB, VAB, BAB, SGB, PGB, NVB, VBB.</w:t>
+      </w:r>
+    </w:p>
+    <w:p>
+      <w:pPr>
+        <w:pStyle w:val="ListBullet"/>
+      </w:pPr>
+      <w:r>
+        <w:t>Mã mặc định trong ô chọn phải thuộc danh sách lựa chọn (nếu không Streamlit báo lỗi).</w:t>
       </w:r>
     </w:p>
     <w:p>
@@ -318,7 +342,15 @@
         <w:pStyle w:val="ListBullet"/>
       </w:pPr>
       <w:r>
-        <w:t>Nhiều mã: bảng so sánh nhanh (giá, % thay đổi, RSI, điểm, nhận định).</w:t>
+        <w:t>Nhiều mã: bảng so sánh nhanh, cột quan trọng trước để không bị khuất trên điện thoại: mã, nhận định, giá, % thay đổi, điểm, RSI.</w:t>
+      </w:r>
+    </w:p>
+    <w:p>
+      <w:pPr>
+        <w:pStyle w:val="ListBullet"/>
+      </w:pPr>
+      <w:r>
+        <w:t>Ô chỉ số không được tràn chữ ở mọi kích thước (điện thoại 375px, máy tính bảng 800px, máy tính 1400px): khối lượng dạng gọn "13.40 tr" (số đầy đủ trong chú thích), giá thấp phiên ở dòng phụ, cỡ chữ co theo độ rộng ô (CSS container query). Biểu đồ: chú thích không đè thanh công cụ, ngày dd/mm/yyyy, số làm tròn khi rê chuột.</w:t>
       </w:r>
     </w:p>
     <w:p>
@@ -505,7 +537,15 @@
         <w:pStyle w:val="ListBullet"/>
       </w:pPr>
       <w:r>
-        <w:t>Quét toàn bộ mã VN50 + ngân hàng: lấy được dữ liệu, ngày mới nhất, giá realtime khớp biểu đồ, không có giá ≤ 0.</w:t>
+        <w:t>Quét toàn bộ mã VNX50 + ngân hàng: lấy được dữ liệu, ngày mới nhất, giá realtime khớp biểu đồ, không có giá ≤ 0.</w:t>
+      </w:r>
+    </w:p>
+    <w:p>
+      <w:pPr>
+        <w:pStyle w:val="ListBullet"/>
+      </w:pPr>
+      <w:r>
+        <w:t>Giả lập tình huống biên trên giao diện: báo giá lỗi nhưng có lịch sử; mã mới niêm yết 1, 2, 30 phiên; không lấy được thành phần rổ (dùng dự phòng, lần sau thử lại).</w:t>
       </w:r>
     </w:p>
     <w:p>

</xml_diff>

<commit_message>
Đổi rổ chỉ số sang VN100
- Thành phần VN100 lấy trực tiếp từ SSI (cache 6 giờ), dự phòng 100 mã tại 07/10/2026
- Tên rổ là hằng số BASKET_GROUP: tiêu đề, nhãn tự đổi theo
- Ngưỡng tối thiểu 80 mã; 109 lựa chọn (VN100 + ngân hàng ngoài rổ)
- Cập nhật test, README, prompt.docx

Co-Authored-By: Claude Opus 5.5 <noreply@anthropic.com>
</commit_message>
<xml_diff>
--- a/prompt.docx
+++ b/prompt.docx
@@ -8,7 +8,7 @@
         <w:jc w:val="center"/>
       </w:pPr>
       <w:r>
-        <w:t>PROMPT: Xây phần mềm web phân tích chứng khoán VN50 &amp; Ngân hàng</w:t>
+        <w:t>PROMPT: Xây phần mềm web phân tích chứng khoán VN100 &amp; Ngân hàng</w:t>
       </w:r>
     </w:p>
     <w:p>
@@ -230,7 +230,7 @@
         <w:pStyle w:val="ListBullet"/>
       </w:pPr>
       <w:r>
-        <w:t>Rổ VN50 = chỉ số VNX50 (50 mã lớn nhất HOSE + HNX). SSI không có nhóm tên "VN50" (trả rỗng). Lấy thành phần trực tiếp: GET https://iboard-query.ssi.com.vn/stock/group/VNX50 → data[].stockSymbol; cache 6 giờ để tự cập nhật khi rổ cơ cấu lại. Kèm danh sách dự phòng (snapshot) khi API lỗi; không lưu cache khi phải dùng dự phòng.</w:t>
+        <w:t>Rổ chỉ số VN100 (100 mã vốn hóa lớn nhất HOSE). Lấy thành phần trực tiếp: GET https://iboard-query.ssi.com.vn/stock/group/VN100 → data[].stockSymbol; cache 6 giờ để tự cập nhật khi rổ cơ cấu lại. Kèm danh sách dự phòng (snapshot) khi API lỗi; không lưu cache khi phải dùng dự phòng. Tên rổ là một hằng số (BASKET_GROUP) để đổi sang VN30, VNX50... chỉ sửa một chỗ. Lưu ý: SSI không có nhóm tên "VN50" (trả rỗng).</w:t>
       </w:r>
     </w:p>
     <w:p>
@@ -238,7 +238,7 @@
         <w:pStyle w:val="ListBullet"/>
       </w:pPr>
       <w:r>
-        <w:t>Lọc kết quả rổ: chỉ nhận chuỗi 3–10 ký tự A–Z/0–9 (giá trị None không được thành mã "NONE"); dưới 20 mã coi như lỗi.</w:t>
+        <w:t>Lọc kết quả rổ: chỉ nhận chuỗi 3–10 ký tự A–Z/0–9 (giá trị None không được thành mã "NONE"); dưới 80 mã coi như lỗi.</w:t>
       </w:r>
     </w:p>
     <w:p>
@@ -247,6 +247,14 @@
       </w:pPr>
       <w:r>
         <w:t>Không tự soạn tay danh sách rổ chỉ số: danh sách tự soạn dễ lỗi thời (đã kiểm chứng lệch 11/50 mã so với VNX50).</w:t>
+      </w:r>
+    </w:p>
+    <w:p>
+      <w:pPr>
+        <w:pStyle w:val="ListBullet"/>
+      </w:pPr>
+      <w:r>
+        <w:t>Mã mới niêm yết chưa đủ 200 phiên (VD: VCK) vẫn phân tích được, chỉ bỏ qua tín hiệu MA200.</w:t>
       </w:r>
     </w:p>
     <w:p>
@@ -326,7 +334,7 @@
         <w:pStyle w:val="ListBullet"/>
       </w:pPr>
       <w:r>
-        <w:t>Thanh bên: multiselect rổ VN50 &amp; ngân hàng (đánh dấu mã ngân hàng), ô nhập mã khác, chọn khoảng 3 tháng / 6 tháng / 1 năm / 2 năm, nút "Làm mới dữ liệu".</w:t>
+        <w:t>Thanh bên: multiselect rổ VN100 &amp; ngân hàng (109 mã, đánh dấu mã ngân hàng), ô nhập mã khác, chọn khoảng 3 tháng / 6 tháng / 1 năm / 2 năm, nút "Làm mới dữ liệu".</w:t>
       </w:r>
     </w:p>
     <w:p>
@@ -511,7 +519,7 @@
         <w:br/>
         <w:t>analysis.py       chấm điểm &amp; nhận định</w:t>
         <w:br/>
-        <w:t>symbols.py        danh sách VN50/ngân hàng, kiểm tra mã nhập</w:t>
+        <w:t>symbols.py        rổ chỉ số (VN100) + dự phòng, danh sách ngân hàng, kiểm tra mã nhập</w:t>
         <w:br/>
         <w:t>tests/            pytest cho đầu vào và dữ liệu bất thường</w:t>
         <w:br/>
@@ -537,7 +545,7 @@
         <w:pStyle w:val="ListBullet"/>
       </w:pPr>
       <w:r>
-        <w:t>Quét toàn bộ mã VNX50 + ngân hàng: lấy được dữ liệu, ngày mới nhất, giá realtime khớp biểu đồ, không có giá ≤ 0.</w:t>
+        <w:t>Quét toàn bộ mã VN100 + ngân hàng (109 mã): lấy được dữ liệu, ngày mới nhất, giá realtime khớp biểu đồ, không có giá ≤ 0.</w:t>
       </w:r>
     </w:p>
     <w:p>

</xml_diff>

<commit_message>
Sửa lỗi phát hiện ở lần rà soát cuối
- Giao cắt MA/MACD: lấy lần cắt gần nhất (trước đây lấy lần cũ nhất -> có thể báo ngược chiều)
- Stochastic: chỉ chấm "cắt lên/cắt xuống" khi thực sự có giao cắt
- Ép cột giá về float64 (SSI có thể trả số nguyên -> lỗi khi ghép giá lẻ)
- Lỗi mạng (kể cả báo giá) giữ 30 giây rồi tự thử lại, không gọi lại SSI mỗi cú click
- Nginx: thêm X-Frame-Options, Referrer-Policy
- Thêm tests/test_analysis.py và test dtype/index; cập nhật prompt.docx

Co-Authored-By: Claude Opus 5.5 <noreply@anthropic.com>
</commit_message>
<xml_diff>
--- a/prompt.docx
+++ b/prompt.docx
@@ -206,7 +206,15 @@
         <w:pStyle w:val="ListBullet"/>
       </w:pPr>
       <w:r>
-        <w:t>Cache bằng st.cache_data (TTL 5 phút, giới hạn 64 mục để không phình RAM khi nhiều người dùng) nhưng KHÔNG lưu cache kết quả lỗi mạng (lỗi tạm thời phải thử lại ngay).</w:t>
+        <w:t>Cache bằng st.cache_data (TTL 5 phút, giới hạn 64 mục để không phình RAM khi nhiều người dùng). Kết quả có lỗi mạng (kể cả lỗi báo giá) chỉ giữ 30 giây rồi tự thử lại: không giữ lỗi suốt 5 phút, nhưng cũng không gọi lại SSI ở mỗi cú click (mỗi lần thử có thể tới ~47 giây khi SSI sập). Nút "Làm mới dữ liệu" thử lại ngay.</w:t>
+      </w:r>
+    </w:p>
+    <w:p>
+      <w:pPr>
+        <w:pStyle w:val="ListBullet"/>
+      </w:pPr>
+      <w:r>
+        <w:t>Ép các cột giá/khối lượng về float64: SSI có thể trả số nguyên (57 thay vì 57.0), cột int64 sẽ lỗi khi ghép giá lẻ.</w:t>
       </w:r>
     </w:p>
     <w:p>
@@ -446,6 +454,14 @@
         <w:pStyle w:val="ListBullet"/>
       </w:pPr>
       <w:r>
+        <w:t>Phát hiện giao cắt phải lấy lần cắt GẦN NHẤT trong cửa sổ (cắt lên rồi cắt xuống → tín hiệu hiện tại là cắt xuống). Stochastic chỉ chấm "cắt lên/cắt xuống %D" khi thực sự có giao cắt trong 2 phiên, không chấm theo vị trí.</w:t>
+      </w:r>
+    </w:p>
+    <w:p>
+      <w:pPr>
+        <w:pStyle w:val="ListBullet"/>
+      </w:pPr>
+      <w:r>
         <w:t>Tổng điểm ≥ +3 → MUA; ≤ −3 → BÁN; còn lại → GIỮ. Hiển thị lý do từng tín hiệu.</w:t>
       </w:r>
     </w:p>
@@ -569,7 +585,15 @@
         <w:pStyle w:val="ListBullet"/>
       </w:pPr>
       <w:r>
-        <w:t>Giả lập mất mạng: app báo lỗi rõ ràng; có mạng lại thì tải được ngay, không bị kẹt lỗi trong cache.</w:t>
+        <w:t>Giả lập SSI sập: app báo lỗi rõ ràng, dùng danh sách rổ dự phòng; các cú click trong 30 giây không gọi lại SSI (đếm số lần gọi); sau 30 giây hoặc khi bấm "Làm mới" thì tự phục hồi.</w:t>
+      </w:r>
+    </w:p>
+    <w:p>
+      <w:pPr>
+        <w:pStyle w:val="ListBullet"/>
+      </w:pPr>
+      <w:r>
+        <w:t>Nhờ một agent độc lập rà soát code với con mắt mới; mỗi lỗi được báo phải tái hiện bằng test thất bại trước khi sửa.</w:t>
       </w:r>
     </w:p>
     <w:p>
@@ -678,7 +702,7 @@
         <w:pStyle w:val="ListBullet"/>
       </w:pPr>
       <w:r>
-        <w:t>Nginx: sao lưu nginx.conf, thêm một server block server_name trading.tieunguyetpham.store dùng chung chứng chỉ; proxy tới http://trading-app:8501 qua biến và resolver 127.0.0.11 (Nginx vẫn khởi động khi trading-app dừng); hỗ trợ WebSocket. nginx.conf được bind-mount dạng một file đơn → sửa bằng cách ghi đè nội dung (giữ inode), không dùng sed -i/mv. Thử nginx -t trên container tạm trước, rồi mới nginx -t và nginx -s reload thật.</w:t>
+        <w:t>Nginx: sao lưu nginx.conf, thêm một server block server_name trading.tieunguyetpham.store dùng chung chứng chỉ; proxy tới http://trading-app:8501 qua biến và resolver 127.0.0.11 (Nginx vẫn khởi động khi trading-app dừng); hỗ trợ WebSocket; header HSTS, X-Content-Type-Options, X-Frame-Options SAMEORIGIN, Referrer-Policy. nginx.conf được bind-mount dạng một file đơn → sửa bằng cách ghi đè nội dung (giữ inode), không dùng sed -i/mv. Thử nginx -t trên container tạm trước, rồi mới nginx -t và nginx -s reload thật.</w:t>
       </w:r>
     </w:p>
     <w:p>

</xml_diff>